<commit_message>
Complete editor fixes: correct affiliation, redraw Figure 1, citation order, legends
- Affiliation set to Department of Cell Biology and Neuroscience (single affiliation)
- Figure 1 redrawn in matplotlib (legend now accurate; shows ablation step)
- Supplementary tables renumbered to citation order; Table 5 no longer cited out of order
- Added citations for interpretability and likelihood-ratio statements
- SVC defined in Table 5 abbreviations; checklist updated

Co-Authored-By: Claude Opus 5.5 <noreply@anthropic.com>
Claude-Session: https://claude.ai/code/session_01VeVSS9n6wvyFkoMoJstEgs
</commit_message>
<xml_diff>
--- a/submission/manuscript.docx
+++ b/submission/manuscript.docx
@@ -45,7 +45,7 @@
         <w:t xml:space="preserve"> </w:t>
       </w:r>
       <w:r>
-        <w:t xml:space="preserve">School of Arts and Sciences, Rutgers University, New Brunswick, USA</w:t>
+        <w:t xml:space="preserve">Department of Cell Biology and Neuroscience, Rutgers University, New Brunswick, USA</w:t>
       </w:r>
     </w:p>
     <w:p>
@@ -186,7 +186,7 @@
         <w:pStyle w:val="BodyText"/>
       </w:pPr>
       <w:r>
-        <w:t xml:space="preserve">Three gaps motivate this work. First, independent reproductions of medical machine-learning results are uncommon, even though reproducibility is a prerequisite for trustworthy translation [18]. Second, interpretability is rarely evaluated alongside performance. Third, and specific to this benchmark: when a model draws on longitudinal EHR features, some of those features may be recorded at the same time as, or after, the diagnosis they are used to predict. This is a form of target (label) leakage, a well-described cause of optimistic performance in machine learning [19,20].</w:t>
+        <w:t xml:space="preserve">Three gaps motivate this work. First, independent reproductions of medical machine-learning results are uncommon, even though reproducibility is a prerequisite for trustworthy translation [18]. Second, interpretability is rarely evaluated alongside performance [17]. Third, and specific to this benchmark: when a model draws on longitudinal EHR features, some of those features may be recorded at the same time as, or after, the diagnosis they are used to predict. This is a form of target (label) leakage, a well-described cause of optimistic performance in machine learning [19,20].</w:t>
       </w:r>
     </w:p>
     <w:p>
@@ -492,7 +492,7 @@
         <w:pStyle w:val="BodyText"/>
       </w:pPr>
       <w:r>
-        <w:t xml:space="preserve">A sensitivity analysis tuned the same model on the training split by five-fold stratified cross-validated grid search, scored by AUROC, over C ∈ {0.01, 0.1, 1.0} and L1 ratio ∈ {0.5, 0.9, 0.99}. As a secondary EHR estimator, used for the specificity-oriented operating point in Table 5, a support-vector classifier (SVC) was fitted: radial basis function kernel, C=1.0, γ=</w:t>
+        <w:t xml:space="preserve">A sensitivity analysis tuned the same model on the training split by five-fold stratified cross-validated grid search, scored by AUROC, over C ∈ {0.01, 0.1, 1.0} and L1 ratio ∈ {0.5, 0.9, 0.99}. As a secondary EHR estimator, used only for the specificity-oriented operating point, a support-vector classifier (SVC) was fitted: radial basis function kernel, C=1.0, γ=</w:t>
       </w:r>
       <w:r>
         <w:t xml:space="preserve">“scale”</w:t>
@@ -654,7 +654,7 @@
         <w:t xml:space="preserve"> </w:t>
       </w:r>
       <w:r>
-        <w:t xml:space="preserve">(the grouping containing deep-vein thrombosis; 2 features). It captures a condition that is typically diagnosed during the PE workup. The exact column list is given in Supplementary Table S2 and is released with the code.</w:t>
+        <w:t xml:space="preserve">(the grouping containing deep-vein thrombosis; 2 features). It captures a condition that is typically diagnosed during the PE workup. The exact column list is given in Supplementary Table S1 and is released with the code.</w:t>
       </w:r>
     </w:p>
     <w:p>
@@ -798,7 +798,7 @@
         </w:numPr>
       </w:pPr>
       <w:r>
-        <w:t xml:space="preserve">positive and negative likelihood ratios (LR+, LR−), with 95% CIs by the log method [26].</w:t>
+        <w:t xml:space="preserve">positive and negative likelihood ratios (LR+, LR−), with 95% CIs by the log method [26]; unlike predictive values, likelihood ratios do not depend on disease prevalence [26].</w:t>
       </w:r>
     </w:p>
     <w:p>
@@ -1744,7 +1744,7 @@
           <w:b/>
           <w:bCs/>
         </w:rPr>
-        <w:t xml:space="preserve">Supplementary Table S1</w:t>
+        <w:t xml:space="preserve">Supplementary Table S2</w:t>
       </w:r>
       <w:r>
         <w:t xml:space="preserve"> </w:t>
@@ -5561,7 +5561,7 @@
           <w:i/>
           <w:iCs/>
         </w:rPr>
-        <w:t xml:space="preserve">PE: pulmonary embolism; EHR: electronic health record; PPV/NPV: positive/negative predictive value; LR+/LR−: positive/negative likelihood ratio; TP/FP/FN/TN: true positives/false positives/false negatives/true negatives; CI: confidence interval; F1: harmonic mean of PPV and sensitivity.</w:t>
+        <w:t xml:space="preserve">PE: pulmonary embolism; EHR: electronic health record; SVC: support-vector classifier; PPV/NPV: positive/negative predictive value; LR+/LR−: positive/negative likelihood ratio; TP/FP/FN/TN: true positives/false positives/false negatives/true negatives; CI: confidence interval; F1: harmonic mean of PPV and sensitivity.</w:t>
       </w:r>
     </w:p>
     <w:p>
@@ -7815,7 +7815,7 @@
           <w:i/>
           <w:iCs/>
         </w:rPr>
-        <w:t xml:space="preserve">Each row refits the elastic-net EHR model with the reference configuration after removing the listed feature group(s); average late fusion is recomputed with the fixed imaging score (imaging-alone AUROC 0.80). AUROC 95% CIs are from 2,000 stratified bootstrap resamples; differences (Δ), their 95% CIs and two-sided p-values are from paired DeLong tests against the full model, or against imaging alone in the penultimate column. Groups were prespecified on clinical criteria before the ablation was run (Supplementary Table S2). A fall in AUROC measures reliance on the excluded features and does not by itself establish leakage. AUROC: area under the receiver operating characteristic curve; CI: confidence interval; EHR: electronic health record.</w:t>
+        <w:t xml:space="preserve">Each row refits the elastic-net EHR model with the reference configuration after removing the listed feature group(s); average late fusion is recomputed with the fixed imaging score (imaging-alone AUROC 0.80). AUROC 95% CIs are from 2,000 stratified bootstrap resamples; differences (Δ), their 95% CIs and two-sided p-values are from paired DeLong tests against the full model, or against imaging alone in the penultimate column. Groups were prespecified on clinical criteria before the ablation was run (Supplementary Table S1). A fall in AUROC measures reliance on the excluded features and does not by itself establish leakage. AUROC: area under the receiver operating characteristic curve; CI: confidence interval; EHR: electronic health record.</w:t>
       </w:r>
     </w:p>
     <w:bookmarkEnd w:id="39"/>
@@ -7835,7 +7835,7 @@
       <w:r>
         <w:drawing>
           <wp:inline>
-            <wp:extent cx="5334000" cy="2167508"/>
+            <wp:extent cx="5334000" cy="2360061"/>
             <wp:effectExtent b="0" l="0" r="0" t="0"/>
             <wp:docPr descr="" title="" id="41" name="Picture"/>
             <a:graphic>
@@ -7856,7 +7856,7 @@
                   <pic:spPr bwMode="auto">
                     <a:xfrm>
                       <a:off x="0" y="0"/>
-                      <a:ext cx="5334000" cy="2167508"/>
+                      <a:ext cx="5334000" cy="2360061"/>
                     </a:xfrm>
                     <a:prstGeom prst="rect">
                       <a:avLst/>
@@ -7896,7 +7896,7 @@
           <w:i/>
           <w:iCs/>
         </w:rPr>
-        <w:t xml:space="preserve">The imaging input is the study-level PENet score distributed with RadFusion (grey: reused, not retrained). The EHR arm is an independently re-implemented elastic-net logistic model (green). The two probabilities are combined by late fusion (average or maximum) to give a study-level PE prediction. SHAP attribution of the EHR arm supports feature interpretation and the label-leakage audit (orange), which is quantified by the feature-exclusion ablation. Created by the author in Python using matplotlib. CTPA: computed tomography pulmonary angiography; EHR: electronic health record; PE: pulmonary embolism; SHAP: SHapley Additive exPlanations.</w:t>
+        <w:t xml:space="preserve">The imaging input is the study-level PENet score distributed with RadFusion (grey: reused, not retrained). The EHR arm is an independently re-implemented elastic-net logistic model (green). The two probabilities are combined by late fusion (average or maximum) to give a study-level PE prediction (blue). The label-leakage audit of the EHR arm (orange) comprises SHAP attribution, the prevalence of leakage-candidate features by PE status, and a feature-exclusion ablation. Created in Python 3.11.15 using matplotlib 3.11.2. CTPA: computed tomography pulmonary angiography; EHR: electronic health record; PE: pulmonary embolism; SHAP: SHapley Additive exPlanations.</w:t>
       </w:r>
     </w:p>
     <w:p>

</xml_diff>